<commit_message>
Apply final pre-submission review fixes
</commit_message>
<xml_diff>
--- a/paper/icemce2026_iop_manuscript.docx
+++ b/paper/icemce2026_iop_manuscript.docx
@@ -703,7 +703,7 @@
         <w:rPr>
           <w:rFonts w:ascii="Times New Roman" w:hAnsi="Times New Roman" w:eastAsia="Times New Roman"/>
         </w:rPr>
-        <w:t>To report contrast, coefficient sharpness, and coefficient geometry separately, each coefficient field is summarised by Cₖ, the discrete maximum gradient magnitude of log(k), and a discrete total-variation proxy. For discontinuous coefficient fields, the log-gradient descriptor depends on grid spacing and is interpreted at fixed N rather than as a continuous invariant. Small-grid spectral evidence is also recorded through the estimated condition number κ(A) = λₘₐₓ(A) / λₘᵢₙ(A).</w:t>
+        <w:t>To report contrast, coefficient sharpness, and coefficient geometry separately, each coefficient field is summarised by Cₖ, the discrete maximum gradient magnitude of log(k), and a discrete total-variation proxy. For discontinuous coefficient fields, the log-gradient descriptor depends on grid spacing and is interpreted at fixed N rather than as a continuous invariant. Small-grid spectral evidence is also recorded through computed condition-number estimates κ(A) = λₘₐₓ(A) / λₘᵢₙ(A).</w:t>
       </w:r>
     </w:p>
     <w:tbl>
@@ -1585,7 +1585,7 @@
         <w:rPr>
           <w:rFonts w:ascii="Times New Roman" w:hAnsi="Times New Roman" w:eastAsia="Times New Roman"/>
         </w:rPr>
-        <w:t>The decision map covers 13 coefficient cases, three grid sizes, and three Krylov/preconditioner choices. The spectral conditioning study uses N = 32, 64, and 128. The rank-correlation analysis uses all 39 case-size decisions and three fixed-grid strata of 13 cases; condition numbers are matched to N = 64 and N = 128 where available, and the N = 128 condition estimate is used as the maximum-available case-level spectral proxy for N = 256. The repeated timing check uses five repeats for one constant case and four high-difficulty cases. The face-averaging sensitivity study reruns the three discontinuous Ck = 100 stress cases with arithmetic and harmonic face averages at N = 64, 128, and 256. The hardware crossover fit used the measured Jacobi-kernel timings at N = 512, 1024, 2048, and 4096.</w:t>
+        <w:t>The decision map covers 13 coefficient cases, three grid sizes, and three Krylov/preconditioner choices. The spectral conditioning study uses N = 32, 64, and 128. The rank-correlation analysis uses all 39 case-size decisions and three fixed-grid strata of 13 cases; condition numbers are matched to N = 64 and N = 128 where available, and the N = 128 condition estimate is used as the maximum-available case-level spectral proxy for N = 256. The repeated timing check uses five repeats for one constant case and four nonconstant representative cases. The face-averaging sensitivity study reruns the three discontinuous Ck = 100 stress cases with arithmetic and harmonic face averages at N = 64, 128, and 256. The hardware crossover fit used the measured Jacobi-kernel timings at N = 512, 1024, 2048, and 4096.</w:t>
       </w:r>
     </w:p>
     <w:p>
@@ -1943,7 +1943,7 @@
       <w:r>
         <w:drawing>
           <wp:inline xmlns:a="http://schemas.openxmlformats.org/drawingml/2006/main" xmlns:pic="http://schemas.openxmlformats.org/drawingml/2006/picture">
-            <wp:extent cx="4709160" cy="3253552"/>
+            <wp:extent cx="4434840" cy="3064025"/>
             <wp:docPr id="1" name="Picture 1"/>
             <wp:cNvGraphicFramePr>
               <a:graphicFrameLocks noChangeAspect="1"/>
@@ -1964,7 +1964,7 @@
                   <pic:spPr>
                     <a:xfrm>
                       <a:off x="0" y="0"/>
-                      <a:ext cx="4709160" cy="3253552"/>
+                      <a:ext cx="4434840" cy="3064025"/>
                     </a:xfrm>
                     <a:prstGeom prst="rect"/>
                   </pic:spPr>
@@ -2520,7 +2520,7 @@
         <w:rPr>
           <w:rFonts w:ascii="Times New Roman" w:hAnsi="Times New Roman" w:eastAsia="Times New Roman"/>
         </w:rPr>
-        <w:t>Table 3 reports representative coefficient descriptors. The spectral evidence confirms that contrast alone is not a complete difficulty measure. At N = 128, the inclusion case with Ck = 100 had an estimated condition number of 6.43e5, while the checkerboard case with the same contrast had a much smaller estimate of 3.12e4 under this discretisation. Figure 2 shows the same effect across the measured coefficient grid.</w:t>
+        <w:t>Table 3 reports representative coefficient descriptors. The spectral evidence confirms that contrast alone is not a complete difficulty measure. At N = 128, the inclusion case with Ck = 100 had a computed condition-number estimate of 6.43e5, while the checkerboard case with the same contrast had a much smaller estimate of 3.12e4 under this discretisation. Figure 2 shows the same effect across the measured coefficient grid.</w:t>
       </w:r>
     </w:p>
     <w:p>
@@ -3251,7 +3251,7 @@
       <w:r>
         <w:drawing>
           <wp:inline xmlns:a="http://schemas.openxmlformats.org/drawingml/2006/main" xmlns:pic="http://schemas.openxmlformats.org/drawingml/2006/picture">
-            <wp:extent cx="4709160" cy="2978335"/>
+            <wp:extent cx="4434840" cy="2804840"/>
             <wp:docPr id="2" name="Picture 2"/>
             <wp:cNvGraphicFramePr>
               <a:graphicFrameLocks noChangeAspect="1"/>
@@ -3272,7 +3272,7 @@
                   <pic:spPr>
                     <a:xfrm>
                       <a:off x="0" y="0"/>
-                      <a:ext cx="4709160" cy="2978335"/>
+                      <a:ext cx="4434840" cy="2804840"/>
                     </a:xfrm>
                     <a:prstGeom prst="rect"/>
                   </pic:spPr>
@@ -3292,7 +3292,7 @@
         <w:rPr>
           <w:rFonts w:ascii="Times New Roman" w:hAnsi="Times New Roman" w:eastAsia="Times New Roman"/>
         </w:rPr>
-        <w:t>Figure 2. Estimated condition number response to coefficient contrast and coefficient geometry.</w:t>
+        <w:t>Figure 2. Computed condition-number response to coefficient contrast and coefficient geometry.</w:t>
       </w:r>
     </w:p>
     <w:p>
@@ -3303,7 +3303,7 @@
         <w:rPr>
           <w:rFonts w:ascii="Times New Roman" w:hAnsi="Times New Roman" w:eastAsia="Times New Roman"/>
         </w:rPr>
-        <w:t>Table 4 turns the coefficient descriptors into a solver-behaviour diagnostic and also shows why a single pooled ranking is unsafe. Across all 39 case-size entries, the matched condition estimate had the largest association with selected-solver speedup (rho = 0.94), while Gk(h) had a larger pooled association with CG iterations (rho = 0.82) than contrast (rho = 0.63). Within fixed-N strata, the condition estimate, contrast, and Gk(h) were all positively associated with CG iterations, with median stratum correlations of rho = 0.96, 0.89, and 0.83, respectively. However, the fixed-grid samples contain only 13 coefficient cases and the case-resampling intervals overlap in the raw CSV archive. The result is therefore used as a descriptive ordering signal and as evidence for stratified reporting, not as a formal claim that these descriptors are significantly separated.</w:t>
+        <w:t>Table 4 turns the coefficient descriptors into a solver-behaviour diagnostic and also shows why a single pooled ranking is unsafe. Across all 39 case-size entries, the matched condition estimate had the largest association with selected-solver speedup (rho = 0.94), while Gk(h) had a larger pooled association with CG iterations (rho = 0.82) than contrast (rho = 0.63). Within fixed-N strata, the condition estimate, contrast, and Gk(h) were all positively associated with CG iterations, with median stratum correlations of rho = 0.96, 0.89, and 0.83, respectively. For the designed structured fields, the cross-case ordering of contrast, sharpness, and total-variation descriptors is mostly resolution-invariant across fixed-N strata; this explains the repeated fixed-grid rank coefficients for those descriptors, while κ(A) still changes with N and is reported separately. However, the fixed-grid samples contain only 13 coefficient cases and the case-resampling intervals overlap in the raw CSV archive. The result is therefore used as a descriptive ordering signal and as evidence for stratified reporting, not as a formal claim that these descriptors are significantly separated.</w:t>
       </w:r>
     </w:p>
     <w:p>
@@ -4418,7 +4418,7 @@
       <w:r>
         <w:drawing>
           <wp:inline xmlns:a="http://schemas.openxmlformats.org/drawingml/2006/main" xmlns:pic="http://schemas.openxmlformats.org/drawingml/2006/picture">
-            <wp:extent cx="4709160" cy="5201279"/>
+            <wp:extent cx="4434840" cy="4898292"/>
             <wp:docPr id="3" name="Picture 3"/>
             <wp:cNvGraphicFramePr>
               <a:graphicFrameLocks noChangeAspect="1"/>
@@ -4439,7 +4439,7 @@
                   <pic:spPr>
                     <a:xfrm>
                       <a:off x="0" y="0"/>
-                      <a:ext cx="4709160" cy="5201279"/>
+                      <a:ext cx="4434840" cy="4898292"/>
                     </a:xfrm>
                     <a:prstGeom prst="rect"/>
                   </pic:spPr>
@@ -5834,7 +5834,7 @@
         <w:rPr>
           <w:rFonts w:ascii="Times New Roman" w:hAnsi="Times New Roman" w:eastAsia="Times New Roman"/>
         </w:rPr>
-        <w:t>The repeat timing check in Table 7 gives a stricter interpretation of the map. For the high-difficulty representative cases at N = 256, AMG-PCG remained the median-best solver in every repeat, with selected-method relative IQR between 0.5% and 6.6%. The constant-coefficient N = 64 case was a near tie: Jacobi-PCG was best by median time, but the per-repeat vote favoured CG in four of five repeats and the median speedup was only 1.03x. The benchmark therefore treats that small-grid constant case as a timing boundary rather than a robust preconditioner preference.</w:t>
+        <w:t>The repeat timing check in Table 7 gives a stricter interpretation of the map. For the nonconstant representative cases at N = 256, AMG-PCG remained the median-best solver in every repeat, with selected-method relative IQR between 0.5% and 6.6%. The constant-coefficient N = 64 case was a near tie: Jacobi-PCG was best by median time, but the per-repeat vote favoured CG in four of five repeats and the median speedup was only 1.03x. The benchmark therefore treats that small-grid constant case as a timing boundary rather than a robust preconditioner preference.</w:t>
       </w:r>
     </w:p>
     <w:p>
@@ -7500,7 +7500,7 @@
       <w:r>
         <w:drawing>
           <wp:inline xmlns:a="http://schemas.openxmlformats.org/drawingml/2006/main" xmlns:pic="http://schemas.openxmlformats.org/drawingml/2006/picture">
-            <wp:extent cx="4709160" cy="2856905"/>
+            <wp:extent cx="4434840" cy="2690483"/>
             <wp:docPr id="4" name="Picture 4"/>
             <wp:cNvGraphicFramePr>
               <a:graphicFrameLocks noChangeAspect="1"/>
@@ -7521,7 +7521,7 @@
                   <pic:spPr>
                     <a:xfrm>
                       <a:off x="0" y="0"/>
-                      <a:ext cx="4709160" cy="2856905"/>
+                      <a:ext cx="4434840" cy="2690483"/>
                     </a:xfrm>
                     <a:prstGeom prst="rect"/>
                   </pic:spPr>
@@ -7553,7 +7553,7 @@
       <w:r>
         <w:drawing>
           <wp:inline xmlns:a="http://schemas.openxmlformats.org/drawingml/2006/main" xmlns:pic="http://schemas.openxmlformats.org/drawingml/2006/picture">
-            <wp:extent cx="4709160" cy="2855505"/>
+            <wp:extent cx="4434840" cy="2689165"/>
             <wp:docPr id="5" name="Picture 5"/>
             <wp:cNvGraphicFramePr>
               <a:graphicFrameLocks noChangeAspect="1"/>
@@ -7574,7 +7574,7 @@
                   <pic:spPr>
                     <a:xfrm>
                       <a:off x="0" y="0"/>
-                      <a:ext cx="4709160" cy="2855505"/>
+                      <a:ext cx="4434840" cy="2689165"/>
                     </a:xfrm>
                     <a:prstGeom prst="rect"/>
                   </pic:spPr>
@@ -8248,7 +8248,7 @@
       <w:r>
         <w:drawing>
           <wp:inline xmlns:a="http://schemas.openxmlformats.org/drawingml/2006/main" xmlns:pic="http://schemas.openxmlformats.org/drawingml/2006/picture">
-            <wp:extent cx="4709160" cy="2855505"/>
+            <wp:extent cx="4434840" cy="2689165"/>
             <wp:docPr id="6" name="Picture 6"/>
             <wp:cNvGraphicFramePr>
               <a:graphicFrameLocks noChangeAspect="1"/>
@@ -8269,7 +8269,7 @@
                   <pic:spPr>
                     <a:xfrm>
                       <a:off x="0" y="0"/>
-                      <a:ext cx="4709160" cy="2855505"/>
+                      <a:ext cx="4434840" cy="2689165"/>
                     </a:xfrm>
                     <a:prstGeom prst="rect"/>
                   </pic:spPr>
@@ -8301,7 +8301,7 @@
       <w:r>
         <w:drawing>
           <wp:inline xmlns:a="http://schemas.openxmlformats.org/drawingml/2006/main" xmlns:pic="http://schemas.openxmlformats.org/drawingml/2006/picture">
-            <wp:extent cx="4709160" cy="2893094"/>
+            <wp:extent cx="4434840" cy="2724564"/>
             <wp:docPr id="7" name="Picture 7"/>
             <wp:cNvGraphicFramePr>
               <a:graphicFrameLocks noChangeAspect="1"/>
@@ -8322,7 +8322,7 @@
                   <pic:spPr>
                     <a:xfrm>
                       <a:off x="0" y="0"/>
-                      <a:ext cx="4709160" cy="2893094"/>
+                      <a:ext cx="4434840" cy="2724564"/>
                     </a:xfrm>
                     <a:prstGeom prst="rect"/>
                   </pic:spPr>
@@ -8794,7 +8794,7 @@
         <w:rPr>
           <w:rFonts w:ascii="Times New Roman" w:hAnsi="Times New Roman" w:eastAsia="Times New Roman"/>
         </w:rPr>
-        <w:t>The main numerical result is the decision-level transition rather than the superiority of a single method in isolation. At small grids, Jacobi-PCG can win because its setup cost is negligible, but the repeated timing check shows that this statement has a near-tie boundary for the constant N = 64 case. Once the grid reaches the tested N = 128 and N = 256 levels, AMG-PCG wins consistently in the decision grid and in the repeated representative checks because its solve-time reduction outweighs the one-time AMG setup cost. This behaviour is consistent with the multilevel purpose of AMG: reduce error across scales rather than relying on local diagonal rescaling.</w:t>
+        <w:t>The main numerical result is the decision-level transition rather than the superiority of a single method in isolation. At small grids, Jacobi-PCG can win because its setup cost is negligible, but the repeated timing check shows that this statement has a near-tie boundary for the constant N = 64 case. Once the grid reaches the tested N = 128 and N = 256 levels, AMG-PCG wins consistently in the decision grid and in the repeated representative checks because its solve-time reduction outweighs the one-time AMG setup cost. For the two headline N = 256 solver comparisons, the reported setup and solve columns imply repeated-right-hand-side break-even counts below one solve, about 0.19 for the smooth case and 0.03 for the high-contrast case, so the AMG decision is already favourable under the stricter single-solve metric. This behaviour is consistent with the multilevel purpose of AMG: reduce error across scales rather than relying on local diagonal rescaling.</w:t>
       </w:r>
     </w:p>
     <w:p>
@@ -8872,6 +8872,28 @@
           <w:rFonts w:ascii="Times New Roman" w:hAnsi="Times New Roman" w:eastAsia="Times New Roman"/>
         </w:rPr>
         <w:t>This paper presented a coefficient-aware finite-difference benchmark for heat-conduction simulation. Smooth verification, an aligned-interface check, coefficient descriptors, setup-inclusive solver decisions, repeated timings, and bounded CPU/CUDA stencil measurements were linked to raw CSV evidence. The main lesson is methodological: solver choice should be reported with discretisation checks, coefficient stratification, setup cost, timing stability, and explicit hardware boundaries. In this benchmark, Jacobi-PCG was selected on the smallest single-pass grid, AMG-PCG dominated the tested larger grids, and CUDA speedups were meaningful only for resident-data stencil kernels at sufficiently large problem sizes.</w:t>
+      </w:r>
+    </w:p>
+    <w:p>
+      <w:pPr>
+        <w:pStyle w:val="IOP-CS-SectionHead"/>
+      </w:pPr>
+      <w:r>
+        <w:rPr>
+          <w:rFonts w:ascii="Times New Roman" w:hAnsi="Times New Roman" w:eastAsia="Times New Roman"/>
+        </w:rPr>
+        <w:t>Acknowledgements</w:t>
+      </w:r>
+    </w:p>
+    <w:p>
+      <w:pPr>
+        <w:pStyle w:val="IOP-CS-BodyNoIndent"/>
+      </w:pPr>
+      <w:r>
+        <w:rPr>
+          <w:rFonts w:ascii="Times New Roman" w:hAnsi="Times New Roman" w:eastAsia="Times New Roman"/>
+        </w:rPr>
+        <w:t>The author used OpenAI GPT-5, Claude Code, and DeepSeek V4 Pro for editorial review, formatting assistance, and consistency checking. The numerical experiments, references, data, and conclusions were checked by the author, who remains responsible for the manuscript.</w:t>
       </w:r>
     </w:p>
     <w:p>
@@ -8893,7 +8915,7 @@
       <w:r>
         <w:rPr>
           <w:rFonts w:ascii="Times New Roman" w:hAnsi="Times New Roman" w:eastAsia="Times New Roman"/>
-          <w:sz w:val="17"/>
+          <w:sz w:val="16"/>
         </w:rPr>
         <w:t>[1] Virtanen P, Gommers R, Oliphant T E, Haberland M, Reddy T, Cournapeau D et al 2020 SciPy 1.0: fundamental algorithms for scientific computing in Python Nature Methods 17 261-272. doi:10.1038/s41592-019-0686-2</w:t>
       </w:r>
@@ -8906,7 +8928,7 @@
       <w:r>
         <w:rPr>
           <w:rFonts w:ascii="Times New Roman" w:hAnsi="Times New Roman" w:eastAsia="Times New Roman"/>
-          <w:sz w:val="17"/>
+          <w:sz w:val="16"/>
         </w:rPr>
         <w:t>[2] Harris C R, Millman K J, van der Walt S J, Gommers R, Virtanen P, Cournapeau D et al 2020 Array programming with NumPy Nature 585 357-362. doi:10.1038/s41586-020-2649-2</w:t>
       </w:r>
@@ -8919,7 +8941,7 @@
       <w:r>
         <w:rPr>
           <w:rFonts w:ascii="Times New Roman" w:hAnsi="Times New Roman" w:eastAsia="Times New Roman"/>
-          <w:sz w:val="17"/>
+          <w:sz w:val="16"/>
         </w:rPr>
         <w:t>[3] Lam S K, Pitrou A and Seibert S 2015 Numba: a LLVM-based Python JIT compiler Proc. Second Workshop on the LLVM Compiler Infrastructure in HPC 1-6. doi:10.1145/2833157.2833162</w:t>
       </w:r>
@@ -8932,7 +8954,7 @@
       <w:r>
         <w:rPr>
           <w:rFonts w:ascii="Times New Roman" w:hAnsi="Times New Roman" w:eastAsia="Times New Roman"/>
-          <w:sz w:val="17"/>
+          <w:sz w:val="16"/>
         </w:rPr>
         <w:t>[4] Bell N, Olson L N, Schroder J and Southworth B 2023 PyAMG: algebraic multigrid solvers in Python Journal of Open Source Software 8 5495. doi:10.21105/joss.05495</w:t>
       </w:r>
@@ -8945,7 +8967,7 @@
       <w:r>
         <w:rPr>
           <w:rFonts w:ascii="Times New Roman" w:hAnsi="Times New Roman" w:eastAsia="Times New Roman"/>
-          <w:sz w:val="17"/>
+          <w:sz w:val="16"/>
         </w:rPr>
         <w:t>[5] Kuhn M B, Henry de Frahan M T, Mohan P, Deskos G, Churchfield M, Cheung L et al 2025 AMR-Wind: a performance-portable, high-fidelity flow solver for wind farm simulations Wind Energy 28. doi:10.1002/we.70010</w:t>
       </w:r>
@@ -8958,7 +8980,7 @@
       <w:r>
         <w:rPr>
           <w:rFonts w:ascii="Times New Roman" w:hAnsi="Times New Roman" w:eastAsia="Times New Roman"/>
-          <w:sz w:val="17"/>
+          <w:sz w:val="16"/>
         </w:rPr>
         <w:t>[6] Li L, Fu X, Zheng X, Li H and Li J 2026 GPU-accelerated finite-element method for the three-dimensional unstructured mesh atmospheric dynamic framework Geoscientific Model Development 19 7525-7544. doi:10.5194/gmd-19-7525-2026</w:t>
       </w:r>
@@ -8971,7 +8993,7 @@
       <w:r>
         <w:rPr>
           <w:rFonts w:ascii="Times New Roman" w:hAnsi="Times New Roman" w:eastAsia="Times New Roman"/>
-          <w:sz w:val="17"/>
+          <w:sz w:val="16"/>
         </w:rPr>
         <w:t>[7] Adams M F, Chen J and Sturdevant B 2026 Fast solvers for tokamak fluid models with PETSc Computer Physics Communications 327 110293. doi:10.1016/j.cpc.2026.110293</w:t>
       </w:r>
@@ -8984,7 +9006,7 @@
       <w:r>
         <w:rPr>
           <w:rFonts w:ascii="Times New Roman" w:hAnsi="Times New Roman" w:eastAsia="Times New Roman"/>
-          <w:sz w:val="17"/>
+          <w:sz w:val="16"/>
         </w:rPr>
         <w:t>[8] Kumar S, Romero J, Seo J-H, Fatica M and Mittal R 2026 A GPU-accelerated sharp interface immersed boundary solver for large scale flow simulations AIAA SCITECH 2026 Forum. doi:10.2514/6.2026-0705</w:t>
       </w:r>
@@ -8997,7 +9019,7 @@
       <w:r>
         <w:rPr>
           <w:rFonts w:ascii="Times New Roman" w:hAnsi="Times New Roman" w:eastAsia="Times New Roman"/>
-          <w:sz w:val="17"/>
+          <w:sz w:val="16"/>
         </w:rPr>
         <w:t>[9] Lapillonne X, Hupp D, Gessler F, Walser A, Pauling A, Lauber A et al 2026 Operational numerical weather prediction with ICON on GPUs (version 2024.10) Geoscientific Model Development 19 755-772. doi:10.5194/gmd-19-755-2026</w:t>
       </w:r>
@@ -9010,7 +9032,7 @@
       <w:r>
         <w:rPr>
           <w:rFonts w:ascii="Times New Roman" w:hAnsi="Times New Roman" w:eastAsia="Times New Roman"/>
-          <w:sz w:val="17"/>
+          <w:sz w:val="16"/>
         </w:rPr>
         <w:t>[10] Strikwerda J C 2004 Finite Difference Schemes and Partial Differential Equations 2nd edn (Philadelphia: SIAM). doi:10.1137/1.9780898717938</w:t>
       </w:r>
@@ -9023,7 +9045,7 @@
       <w:r>
         <w:rPr>
           <w:rFonts w:ascii="Times New Roman" w:hAnsi="Times New Roman" w:eastAsia="Times New Roman"/>
-          <w:sz w:val="17"/>
+          <w:sz w:val="16"/>
         </w:rPr>
         <w:t>[11] Hestenes M R and Stiefel E 1952 Methods of conjugate gradients for solving linear systems Journal of Research of the National Bureau of Standards 49 409-436. doi:10.6028/jres.049.044</w:t>
       </w:r>
@@ -9036,7 +9058,7 @@
       <w:r>
         <w:rPr>
           <w:rFonts w:ascii="Times New Roman" w:hAnsi="Times New Roman" w:eastAsia="Times New Roman"/>
-          <w:sz w:val="17"/>
+          <w:sz w:val="16"/>
         </w:rPr>
         <w:t>[12] Saad Y 2003 Iterative Methods for Sparse Linear Systems 2nd edn (Philadelphia: SIAM). doi:10.1137/1.9780898718003</w:t>
       </w:r>
@@ -9049,7 +9071,7 @@
       <w:r>
         <w:rPr>
           <w:rFonts w:ascii="Times New Roman" w:hAnsi="Times New Roman" w:eastAsia="Times New Roman"/>
-          <w:sz w:val="17"/>
+          <w:sz w:val="16"/>
         </w:rPr>
         <w:t>[13] Briggs W L, Henson V E and McCormick S F 2000 A Multigrid Tutorial 2nd edn (Philadelphia: SIAM). doi:10.1137/1.9780898719505</w:t>
       </w:r>
@@ -9062,7 +9084,7 @@
       <w:r>
         <w:rPr>
           <w:rFonts w:ascii="Times New Roman" w:hAnsi="Times New Roman" w:eastAsia="Times New Roman"/>
-          <w:sz w:val="17"/>
+          <w:sz w:val="16"/>
         </w:rPr>
         <w:t>[14] Ruge J W and Stuben K 1987 Algebraic multigrid in McCormick S F (ed) Multigrid Methods (Philadelphia: SIAM) 73-130. doi:10.1137/1.9781611971057.ch4</w:t>
       </w:r>
@@ -9075,7 +9097,7 @@
       <w:r>
         <w:rPr>
           <w:rFonts w:ascii="Times New Roman" w:hAnsi="Times New Roman" w:eastAsia="Times New Roman"/>
-          <w:sz w:val="17"/>
+          <w:sz w:val="16"/>
         </w:rPr>
         <w:t>[15] Bernaschi M, Celestini A, Richelli G and D'Ambra P 2026 On the energy efficiency of sparse matrix computations on multi-GPU clusters Future Generation Computer Systems 183 108519. doi:10.1016/j.future.2026.108519</w:t>
       </w:r>
@@ -9088,7 +9110,7 @@
       <w:r>
         <w:rPr>
           <w:rFonts w:ascii="Times New Roman" w:hAnsi="Times New Roman" w:eastAsia="Times New Roman"/>
-          <w:sz w:val="17"/>
+          <w:sz w:val="16"/>
         </w:rPr>
         <w:t>[16] Welter A and Nguyen N C 2026 Preconditioning techniques for hybridizable discontinuous Galerkin discretizations on GPU architectures Computer Methods in Applied Mechanics and Engineering 456 118951. doi:10.1016/j.cma.2026.118951</w:t>
       </w:r>
@@ -9101,7 +9123,7 @@
       <w:r>
         <w:rPr>
           <w:rFonts w:ascii="Times New Roman" w:hAnsi="Times New Roman" w:eastAsia="Times New Roman"/>
-          <w:sz w:val="17"/>
+          <w:sz w:val="16"/>
         </w:rPr>
         <w:t>[17] Yuan F, Yang X, Huang Y, Dong D, Xu C, Liu J et al 2025 CRAMG: a communication-reduced algebraic multigrid method Proc. 39th ACM International Conference on Supercomputing 397-411. doi:10.1145/3721145.3725764</w:t>
       </w:r>
@@ -9114,7 +9136,7 @@
       <w:r>
         <w:rPr>
           <w:rFonts w:ascii="Times New Roman" w:hAnsi="Times New Roman" w:eastAsia="Times New Roman"/>
-          <w:sz w:val="17"/>
+          <w:sz w:val="16"/>
         </w:rPr>
         <w:t>[18] Green D, Hu X, Lore J, Mu L and Stowell M L 2022 An efficient high-order numerical solver for diffusion equations with strong anisotropy Computer Physics Communications 276 108333. doi:10.1016/j.cpc.2022.108333</w:t>
       </w:r>
@@ -9127,7 +9149,7 @@
       <w:r>
         <w:rPr>
           <w:rFonts w:ascii="Times New Roman" w:hAnsi="Times New Roman" w:eastAsia="Times New Roman"/>
-          <w:sz w:val="17"/>
+          <w:sz w:val="16"/>
         </w:rPr>
         <w:t>[19] NVIDIA Corporation 2026 CUDA C++ Programming Guide. https://docs.nvidia.com/cuda/cuda-c-programming-guide/ accessed 3 September 2026</w:t>
       </w:r>
@@ -9140,7 +9162,7 @@
       <w:r>
         <w:rPr>
           <w:rFonts w:ascii="Times New Roman" w:hAnsi="Times New Roman" w:eastAsia="Times New Roman"/>
-          <w:sz w:val="17"/>
+          <w:sz w:val="16"/>
         </w:rPr>
         <w:t>[20] NVIDIA Corporation 2026 Numba-CUDA Documentation. https://nvidia.github.io/numba-cuda/ accessed 3 September 2026</w:t>
       </w:r>
@@ -9153,7 +9175,7 @@
       <w:r>
         <w:rPr>
           <w:rFonts w:ascii="Times New Roman" w:hAnsi="Times New Roman" w:eastAsia="Times New Roman"/>
-          <w:sz w:val="17"/>
+          <w:sz w:val="16"/>
         </w:rPr>
         <w:t>[21] Pekkila J, Lappi O, Robertsen F and Korpi-Lagg M J 2025 Stencil computations on AMD and Nvidia graphics processors: performance and tuning strategies Concurrency and Computation: Practice and Experience 37. doi:10.1002/cpe.70129</w:t>
       </w:r>
@@ -9166,7 +9188,7 @@
       <w:r>
         <w:rPr>
           <w:rFonts w:ascii="Times New Roman" w:hAnsi="Times New Roman" w:eastAsia="Times New Roman"/>
-          <w:sz w:val="17"/>
+          <w:sz w:val="16"/>
         </w:rPr>
         <w:t>[22] Makhmut Y, Imankulov T, Gorlatch S and Matkerim B 2026 A CUDA performance study of global- and shared-memory kernels for the Buckley-Leverett polymer-flooding problem Applied Sciences 16 5449. doi:10.3390/app16115449</w:t>
       </w:r>
@@ -9179,7 +9201,7 @@
       <w:r>
         <w:rPr>
           <w:rFonts w:ascii="Times New Roman" w:hAnsi="Times New Roman" w:eastAsia="Times New Roman"/>
-          <w:sz w:val="17"/>
+          <w:sz w:val="16"/>
         </w:rPr>
         <w:t>[23] Koskela T, Christidi I, Giordano M, Dubrovska E, Quinn J, Maynard C et al 2023 Principles for automated and reproducible benchmarking Proc. SC '23 Workshops 609-618. doi:10.1145/3624062.3624133</w:t>
       </w:r>

</xml_diff>